<commit_message>
docs: actualizar resumen — listas oficiales FRA/NZL, regla IDs, limpieza picks, arquitectura G+A
</commit_message>
<xml_diff>
--- a/DOCUMENTO RESUMEN ACTUALIZADO 14-05-2026.docx
+++ b/DOCUMENTO RESUMEN ACTUALIZADO 14-05-2026.docx
@@ -5113,6 +5113,285 @@
           <w:szCs w:val="20"/>
         </w:rPr>
         <w:t xml:space="preserve">•  Pesos: Black, ExtraBold, Bold, SemiBold, Regular, Light</w:t>
+      </w:r>
+    </w:p>
+    <w:p>
+      <w:pPr>
+        <w:spacing w:before="320" w:after="120"/>
+        <w:pBdr>
+          <w:top w:val="single" w:sz="6" w:space="1" w:color="003087"/>
+        </w:pBdr>
+      </w:pPr>
+      <w:r>
+        <w:rPr>
+          <w:rFonts w:ascii="Arial" w:cs="Arial" w:eastAsia="Arial" w:hAnsi="Arial"/>
+          <w:b/>
+          <w:bCs/>
+          <w:color w:val="003087"/>
+          <w:sz w:val="28"/>
+          <w:szCs w:val="28"/>
+        </w:rPr>
+        <w:t>SESIÓN 14/05/2026 — CONTINUACIóN (PARTE 2)</w:t>
+      </w:r>
+    </w:p>
+    <w:p>
+      <w:pPr>
+        <w:spacing w:before="120" w:after="40"/>
+      </w:pPr>
+      <w:r>
+        <w:rPr>
+          <w:rFonts w:ascii="Arial" w:cs="Arial" w:eastAsia="Arial" w:hAnsi="Arial"/>
+          <w:b/>
+          <w:bCs/>
+          <w:color w:val="CE1126"/>
+          <w:sz w:val="22"/>
+          <w:szCs w:val="22"/>
+        </w:rPr>
+        <w:t>1. LISTAS OFICIALES CARGADAS EN datos.js</w:t>
+      </w:r>
+    </w:p>
+    <w:p>
+      <w:pPr>
+        <w:spacing w:before="20" w:after="20"/>
+        <w:ind w:left="360"/>
+      </w:pPr>
+      <w:r>
+        <w:rPr>
+          <w:rFonts w:ascii="Arial" w:cs="Arial" w:eastAsia="Arial" w:hAnsi="Arial"/>
+          <w:color w:val="1a1a2e"/>
+          <w:sz w:val="20"/>
+          <w:szCs w:val="20"/>
+        </w:rPr>
+        <w:t xml:space="preserve">•  Francia (26 jugadores): IDs fra-1 a fra-34 (con gaps). IDs originales preservados para no romper picks. Eliminados: fra-3, fra-9, fra-10, fra-11, fra-13, fra-16, fra-19, fra-28. Nuevos: fra-30..fra-34 (Robin Risser, Lucas Digne, Lucas Hernández, Maghnes Akliouche, Jean-Philippe Mateta).</w:t>
+      </w:r>
+    </w:p>
+    <w:p>
+      <w:pPr>
+        <w:spacing w:before="20" w:after="20"/>
+        <w:ind w:left="360"/>
+      </w:pPr>
+      <w:r>
+        <w:rPr>
+          <w:rFonts w:ascii="Arial" w:cs="Arial" w:eastAsia="Arial" w:hAnsi="Arial"/>
+          <w:color w:val="1a1a2e"/>
+          <w:sz w:val="20"/>
+          <w:szCs w:val="20"/>
+        </w:rPr>
+        <w:t xml:space="preserve">•  Nueva Zelanda (26 jugadores): IDs nzl-1 a nzl-37 (con gaps). IDs originales preservados. Eliminados: nzl-2, nzl-5, nzl-6, nzl-9, nzl-10, nzl-12, nzl-16, nzl-18, nzl-19, nzl-23, nzl-24. Nuevos: nzl-27..nzl-37.</w:t>
+      </w:r>
+    </w:p>
+    <w:p>
+      <w:pPr>
+        <w:spacing w:before="20" w:after="20"/>
+        <w:ind w:left="360"/>
+      </w:pPr>
+      <w:r>
+        <w:rPr>
+          <w:rFonts w:ascii="Arial" w:cs="Arial" w:eastAsia="Arial" w:hAnsi="Arial"/>
+          <w:color w:val="1a1a2e"/>
+          <w:sz w:val="20"/>
+          <w:szCs w:val="20"/>
+        </w:rPr>
+        <w:t xml:space="preserve">•  Suecia (SWE) y Bosnia-Herzegovina (BIH): ya cargadas en sesión anterior.</w:t>
+      </w:r>
+    </w:p>
+    <w:p>
+      <w:pPr>
+        <w:spacing w:before="20" w:after="20"/>
+        <w:ind w:left="360"/>
+      </w:pPr>
+      <w:r>
+        <w:rPr>
+          <w:rFonts w:ascii="Arial" w:cs="Arial" w:eastAsia="Arial" w:hAnsi="Arial"/>
+          <w:color w:val="1a1a2e"/>
+          <w:sz w:val="20"/>
+          <w:szCs w:val="20"/>
+        </w:rPr>
+        <w:t xml:space="preserve">•  Commit: fix: restaurar IDs originales Francia/NZL — preservar picks existentes</w:t>
+      </w:r>
+    </w:p>
+    <w:p>
+      <w:pPr>
+        <w:spacing w:before="120" w:after="40"/>
+      </w:pPr>
+      <w:r>
+        <w:rPr>
+          <w:rFonts w:ascii="Arial" w:cs="Arial" w:eastAsia="Arial" w:hAnsi="Arial"/>
+          <w:b/>
+          <w:bCs/>
+          <w:color w:val="CE1126"/>
+          <w:sz w:val="22"/>
+          <w:szCs w:val="22"/>
+        </w:rPr>
+        <w:t>2. REGLA DE ORO — IDs DE JUGADORES</w:t>
+      </w:r>
+    </w:p>
+    <w:p>
+      <w:pPr>
+        <w:spacing w:before="20" w:after="20"/>
+        <w:ind w:left="360"/>
+      </w:pPr>
+      <w:r>
+        <w:rPr>
+          <w:rFonts w:ascii="Arial" w:cs="Arial" w:eastAsia="Arial" w:hAnsi="Arial"/>
+          <w:color w:val="1a1a2e"/>
+          <w:sz w:val="20"/>
+          <w:szCs w:val="20"/>
+        </w:rPr>
+        <w:t xml:space="preserve">•  Nunca renumerar IDs existentes en datos.js. Los jugadores que salen simplemente se eliminan (dejando el ID vacío). Los jugadores nuevos reciben el siguiente ID secuencial disponible (ej: fra-30, fra-31...). Esto garantiza que picks existentes en Supabase no queden rotos.</w:t>
+      </w:r>
+    </w:p>
+    <w:p>
+      <w:pPr>
+        <w:spacing w:before="120" w:after="40"/>
+      </w:pPr>
+      <w:r>
+        <w:rPr>
+          <w:rFonts w:ascii="Arial" w:cs="Arial" w:eastAsia="Arial" w:hAnsi="Arial"/>
+          <w:b/>
+          <w:bCs/>
+          <w:color w:val="CE1126"/>
+          <w:sz w:val="22"/>
+          <w:szCs w:val="22"/>
+        </w:rPr>
+        <w:t>3. LIMPIEZA DE PICKS INVÁLIDOS</w:t>
+      </w:r>
+    </w:p>
+    <w:p>
+      <w:pPr>
+        <w:spacing w:before="20" w:after="20"/>
+        <w:ind w:left="360"/>
+      </w:pPr>
+      <w:r>
+        <w:rPr>
+          <w:rFonts w:ascii="Arial" w:cs="Arial" w:eastAsia="Arial" w:hAnsi="Arial"/>
+          <w:color w:val="1a1a2e"/>
+          <w:sz w:val="20"/>
+          <w:szCs w:val="20"/>
+        </w:rPr>
+        <w:t xml:space="preserve">•  Script creado: scripts/limpiar-picks-killer.js</w:t>
+      </w:r>
+    </w:p>
+    <w:p>
+      <w:pPr>
+        <w:spacing w:before="20" w:after="20"/>
+        <w:ind w:left="360"/>
+      </w:pPr>
+      <w:r>
+        <w:rPr>
+          <w:rFonts w:ascii="Arial" w:cs="Arial" w:eastAsia="Arial" w:hAnsi="Arial"/>
+          <w:color w:val="1a1a2e"/>
+          <w:sz w:val="20"/>
+          <w:szCs w:val="20"/>
+        </w:rPr>
+        <w:t xml:space="preserve">•  Elimina de usuarios.picks_data.killer cualquier ID de jugador eliminado de listas oficiales.</w:t>
+      </w:r>
+    </w:p>
+    <w:p>
+      <w:pPr>
+        <w:spacing w:before="20" w:after="20"/>
+        <w:ind w:left="360"/>
+      </w:pPr>
+      <w:r>
+        <w:rPr>
+          <w:rFonts w:ascii="Arial" w:cs="Arial" w:eastAsia="Arial" w:hAnsi="Arial"/>
+          <w:color w:val="1a1a2e"/>
+          <w:sz w:val="20"/>
+          <w:szCs w:val="20"/>
+        </w:rPr>
+        <w:t xml:space="preserve">•  Resultado al ejecutar hoy: 2 usuarios con picks_data, 0 picks inválidos encontrados.</w:t>
+      </w:r>
+    </w:p>
+    <w:p>
+      <w:pPr>
+        <w:spacing w:before="20" w:after="20"/>
+        <w:ind w:left="360"/>
+      </w:pPr>
+      <w:r>
+        <w:rPr>
+          <w:rFonts w:ascii="Arial" w:cs="Arial" w:eastAsia="Arial" w:hAnsi="Arial"/>
+          <w:color w:val="1a1a2e"/>
+          <w:sz w:val="20"/>
+          <w:szCs w:val="20"/>
+        </w:rPr>
+        <w:t xml:space="preserve">•  Para ejecutar en el futuro: $env:SUPABASE_URL=“...” ; $env:SUPABASE_SERVICE_KEY=“...” ; node scripts/limpiar-picks-killer.js</w:t>
+      </w:r>
+    </w:p>
+    <w:p>
+      <w:pPr>
+        <w:spacing w:before="120" w:after="40"/>
+      </w:pPr>
+      <w:r>
+        <w:rPr>
+          <w:rFonts w:ascii="Arial" w:cs="Arial" w:eastAsia="Arial" w:hAnsi="Arial"/>
+          <w:b/>
+          <w:bCs/>
+          <w:color w:val="CE1126"/>
+          <w:sz w:val="22"/>
+          <w:szCs w:val="22"/>
+        </w:rPr>
+        <w:t>4. ARQUITECTURA G+A — EL KILLER (confirmado)</w:t>
+      </w:r>
+    </w:p>
+    <w:p>
+      <w:pPr>
+        <w:spacing w:before="20" w:after="20"/>
+        <w:ind w:left="360"/>
+      </w:pPr>
+      <w:r>
+        <w:rPr>
+          <w:rFonts w:ascii="Arial" w:cs="Arial" w:eastAsia="Arial" w:hAnsi="Arial"/>
+          <w:color w:val="1a1a2e"/>
+          <w:sz w:val="20"/>
+          <w:szCs w:val="20"/>
+        </w:rPr>
+        <w:t xml:space="preserve">•  Flujo: Sportmonks API topscorers → match por jugadores.sportmonks_id → UPDATE estadisticas_jugadores (goles, asistencias, puntos_killer=G+A) → recalcularRankingKiller() suma puntos de los 15 picks de cada usuario → ranking_killer.</w:t>
+      </w:r>
+    </w:p>
+    <w:p>
+      <w:pPr>
+        <w:spacing w:before="20" w:after="20"/>
+        <w:ind w:left="360"/>
+      </w:pPr>
+      <w:r>
+        <w:rPr>
+          <w:rFonts w:ascii="Arial" w:cs="Arial" w:eastAsia="Arial" w:hAnsi="Arial"/>
+          <w:color w:val="1a1a2e"/>
+          <w:sz w:val="20"/>
+          <w:szCs w:val="20"/>
+        </w:rPr>
+        <w:t xml:space="preserve">•  PENDIENTE: llenar sportmonks_id en tabla jugadores de Supabase. Se hará cuando se pague la suscripción de Sportmonks. El cron ya está listo y esperando.</w:t>
+      </w:r>
+    </w:p>
+    <w:p>
+      <w:pPr>
+        <w:spacing w:before="120" w:after="40"/>
+      </w:pPr>
+      <w:r>
+        <w:rPr>
+          <w:rFonts w:ascii="Arial" w:cs="Arial" w:eastAsia="Arial" w:hAnsi="Arial"/>
+          <w:b/>
+          <w:bCs/>
+          <w:color w:val="CE1126"/>
+          <w:sz w:val="22"/>
+          <w:szCs w:val="22"/>
+        </w:rPr>
+        <w:t>5. TODOS LOS CAMBIOS PUSHEADOS</w:t>
+      </w:r>
+    </w:p>
+    <w:p>
+      <w:pPr>
+        <w:spacing w:before="20" w:after="20"/>
+        <w:ind w:left="360"/>
+      </w:pPr>
+      <w:r>
+        <w:rPr>
+          <w:rFonts w:ascii="Arial" w:cs="Arial" w:eastAsia="Arial" w:hAnsi="Arial"/>
+          <w:color w:val="1a1a2e"/>
+          <w:sz w:val="20"/>
+          <w:szCs w:val="20"/>
+        </w:rPr>
+        <w:t xml:space="preserve">•  Todos los cambios de esta sesión están en GitHub: https://github.com/SamirFlorez11/rosca-mundial</w:t>
       </w:r>
     </w:p>
     <w:p>

</xml_diff>

<commit_message>
docs: protocolo actualización listas, confirmación picks intactos, pendiente tabla jugadores
</commit_message>
<xml_diff>
--- a/DOCUMENTO RESUMEN ACTUALIZADO 14-05-2026.docx
+++ b/DOCUMENTO RESUMEN ACTUALIZADO 14-05-2026.docx
@@ -5392,6 +5392,345 @@
           <w:szCs w:val="20"/>
         </w:rPr>
         <w:t xml:space="preserve">•  Todos los cambios de esta sesión están en GitHub: https://github.com/SamirFlorez11/rosca-mundial</w:t>
+      </w:r>
+    </w:p>
+    <w:p>
+      <w:pPr>
+        <w:spacing w:before="320" w:after="120"/>
+        <w:pBdr>
+          <w:top w:val="single" w:sz="6" w:space="1" w:color="003087"/>
+        </w:pBdr>
+      </w:pPr>
+      <w:r>
+        <w:rPr>
+          <w:rFonts w:ascii="Arial" w:cs="Arial" w:eastAsia="Arial" w:hAnsi="Arial"/>
+          <w:b/>
+          <w:bCs/>
+          <w:color w:val="003087"/>
+          <w:sz w:val="28"/>
+          <w:szCs w:val="28"/>
+        </w:rPr>
+        <w:t>SESIÓN 14/05/2026 — PARTE 3: PROTOCOLO ACTUALIZACIÓN DE LISTAS</w:t>
+      </w:r>
+    </w:p>
+    <w:p>
+      <w:pPr>
+        <w:spacing w:before="120" w:after="40"/>
+      </w:pPr>
+      <w:r>
+        <w:rPr>
+          <w:rFonts w:ascii="Arial" w:cs="Arial" w:eastAsia="Arial" w:hAnsi="Arial"/>
+          <w:b/>
+          <w:bCs/>
+          <w:color w:val="CE1126"/>
+          <w:sz w:val="22"/>
+          <w:szCs w:val="22"/>
+        </w:rPr>
+        <w:t>1. CONFIRMACIÓN: NINGÚN USUARIO PERDIÓ PICKS</w:t>
+      </w:r>
+    </w:p>
+    <w:p>
+      <w:pPr>
+        <w:spacing w:before="20" w:after="20"/>
+        <w:ind w:left="360"/>
+      </w:pPr>
+      <w:r>
+        <w:rPr>
+          <w:rFonts w:ascii="Arial" w:cs="Arial" w:eastAsia="Arial" w:hAnsi="Arial"/>
+          <w:color w:val="1a1a2e"/>
+          <w:sz w:val="20"/>
+          <w:szCs w:val="20"/>
+        </w:rPr>
+        <w:t xml:space="preserve">•  Solo 2 usuarios tenían picks guardados al momento de actualizar Francia y Nueva Zelanda.</w:t>
+      </w:r>
+    </w:p>
+    <w:p>
+      <w:pPr>
+        <w:spacing w:before="20" w:after="20"/>
+        <w:ind w:left="360"/>
+      </w:pPr>
+      <w:r>
+        <w:rPr>
+          <w:rFonts w:ascii="Arial" w:cs="Arial" w:eastAsia="Arial" w:hAnsi="Arial"/>
+          <w:color w:val="1a1a2e"/>
+          <w:sz w:val="20"/>
+          <w:szCs w:val="20"/>
+        </w:rPr>
+        <w:t xml:space="preserve">•  Ninguno tenía jugadores eliminados en su killer. Script de limpieza reportó 0 picks inválidos.</w:t>
+      </w:r>
+    </w:p>
+    <w:p>
+      <w:pPr>
+        <w:spacing w:before="20" w:after="20"/>
+        <w:ind w:left="360"/>
+      </w:pPr>
+      <w:r>
+        <w:rPr>
+          <w:rFonts w:ascii="Arial" w:cs="Arial" w:eastAsia="Arial" w:hAnsi="Arial"/>
+          <w:color w:val="1a1a2e"/>
+          <w:sz w:val="20"/>
+          <w:szCs w:val="20"/>
+        </w:rPr>
+        <w:t xml:space="preserve">•  Se limpió el killer de samirleo1195@gmail.com por solicitud explícita (confusión visual durante el window del edit incorrecto). El resto de picks de esa cuenta quedó intacto.</w:t>
+      </w:r>
+    </w:p>
+    <w:p>
+      <w:pPr>
+        <w:spacing w:before="120" w:after="40"/>
+      </w:pPr>
+      <w:r>
+        <w:rPr>
+          <w:rFonts w:ascii="Arial" w:cs="Arial" w:eastAsia="Arial" w:hAnsi="Arial"/>
+          <w:b/>
+          <w:bCs/>
+          <w:color w:val="CE1126"/>
+          <w:sz w:val="22"/>
+          <w:szCs w:val="22"/>
+        </w:rPr>
+        <w:t>2. REGLA DE ORO — IDs DE JUGADORES (IRROMPIBLE)</w:t>
+      </w:r>
+    </w:p>
+    <w:p>
+      <w:pPr>
+        <w:spacing w:before="20" w:after="20"/>
+        <w:ind w:left="360"/>
+      </w:pPr>
+      <w:r>
+        <w:rPr>
+          <w:rFonts w:ascii="Arial" w:cs="Arial" w:eastAsia="Arial" w:hAnsi="Arial"/>
+          <w:color w:val="1a1a2e"/>
+          <w:sz w:val="20"/>
+          <w:szCs w:val="20"/>
+        </w:rPr>
+        <w:t xml:space="preserve">•  Jugador que SALE → borrar su entrada en datos.js. El ID queda libre para siempre (no se reutiliza, no se reasigna).</w:t>
+      </w:r>
+    </w:p>
+    <w:p>
+      <w:pPr>
+        <w:spacing w:before="20" w:after="20"/>
+        <w:ind w:left="360"/>
+      </w:pPr>
+      <w:r>
+        <w:rPr>
+          <w:rFonts w:ascii="Arial" w:cs="Arial" w:eastAsia="Arial" w:hAnsi="Arial"/>
+          <w:color w:val="1a1a2e"/>
+          <w:sz w:val="20"/>
+          <w:szCs w:val="20"/>
+        </w:rPr>
+        <w:t xml:space="preserve">•  Jugador NUEVO → siguiente ID secuencial al final del bloque de esa selección (ej: si el último era fra-29 el nuevo es fra-30).</w:t>
+      </w:r>
+    </w:p>
+    <w:p>
+      <w:pPr>
+        <w:spacing w:before="20" w:after="20"/>
+        <w:ind w:left="360"/>
+      </w:pPr>
+      <w:r>
+        <w:rPr>
+          <w:rFonts w:ascii="Arial" w:cs="Arial" w:eastAsia="Arial" w:hAnsi="Arial"/>
+          <w:color w:val="1a1a2e"/>
+          <w:sz w:val="20"/>
+          <w:szCs w:val="20"/>
+        </w:rPr>
+        <w:t xml:space="preserve">•  NUNCA renumerar IDs existentes. Eso rompe los picks de todos los usuarios que ya guardaron.</w:t>
+      </w:r>
+    </w:p>
+    <w:p>
+      <w:pPr>
+        <w:spacing w:before="120" w:after="40"/>
+      </w:pPr>
+      <w:r>
+        <w:rPr>
+          <w:rFonts w:ascii="Arial" w:cs="Arial" w:eastAsia="Arial" w:hAnsi="Arial"/>
+          <w:b/>
+          <w:bCs/>
+          <w:color w:val="CE1126"/>
+          <w:sz w:val="22"/>
+          <w:szCs w:val="22"/>
+        </w:rPr>
+        <w:t>3. PROTOCOLO EXACTO PARA CADA LISTA OFICIAL NUEVA (ORDEN CRÍTICO)</w:t>
+      </w:r>
+    </w:p>
+    <w:p>
+      <w:pPr>
+        <w:spacing w:before="20" w:after="20"/>
+        <w:ind w:left="360"/>
+      </w:pPr>
+      <w:r>
+        <w:rPr>
+          <w:rFonts w:ascii="Arial" w:cs="Arial" w:eastAsia="Arial" w:hAnsi="Arial"/>
+          <w:color w:val="1a1a2e"/>
+          <w:sz w:val="20"/>
+          <w:szCs w:val="20"/>
+        </w:rPr>
+        <w:t xml:space="preserve">•  PASO 1: Identificar qué IDs salen (jugadores eliminados) ANTES de tocar datos.js.</w:t>
+      </w:r>
+    </w:p>
+    <w:p>
+      <w:pPr>
+        <w:spacing w:before="20" w:after="20"/>
+        <w:ind w:left="360"/>
+      </w:pPr>
+      <w:r>
+        <w:rPr>
+          <w:rFonts w:ascii="Arial" w:cs="Arial" w:eastAsia="Arial" w:hAnsi="Arial"/>
+          <w:color w:val="1a1a2e"/>
+          <w:sz w:val="20"/>
+          <w:szCs w:val="20"/>
+        </w:rPr>
+        <w:t xml:space="preserve">•  PASO 2: Agregar esos IDs a IDS_INVALIDOS en scripts/limpiar-picks-killer.js.</w:t>
+      </w:r>
+    </w:p>
+    <w:p>
+      <w:pPr>
+        <w:spacing w:before="20" w:after="20"/>
+        <w:ind w:left="360"/>
+      </w:pPr>
+      <w:r>
+        <w:rPr>
+          <w:rFonts w:ascii="Arial" w:cs="Arial" w:eastAsia="Arial" w:hAnsi="Arial"/>
+          <w:color w:val="1a1a2e"/>
+          <w:sz w:val="20"/>
+          <w:szCs w:val="20"/>
+        </w:rPr>
+        <w:t xml:space="preserve">•  PASO 3: Ejecutar el script de limpieza y verificar el reporte (cuántos picks eliminados, de qué usuarios).</w:t>
+      </w:r>
+    </w:p>
+    <w:p>
+      <w:pPr>
+        <w:spacing w:before="20" w:after="20"/>
+        <w:ind w:left="360"/>
+      </w:pPr>
+      <w:r>
+        <w:rPr>
+          <w:rFonts w:ascii="Arial" w:cs="Arial" w:eastAsia="Arial" w:hAnsi="Arial"/>
+          <w:color w:val="1a1a2e"/>
+          <w:sz w:val="20"/>
+          <w:szCs w:val="20"/>
+        </w:rPr>
+        <w:t xml:space="preserve">•  PASO 4 (solo después del cleanup): editar datos.js — borrar entradas eliminadas, agregar nuevos con IDs incrementales al final del bloque.</w:t>
+      </w:r>
+    </w:p>
+    <w:p>
+      <w:pPr>
+        <w:spacing w:before="20" w:after="20"/>
+        <w:ind w:left="360"/>
+      </w:pPr>
+      <w:r>
+        <w:rPr>
+          <w:rFonts w:ascii="Arial" w:cs="Arial" w:eastAsia="Arial" w:hAnsi="Arial"/>
+          <w:color w:val="1a1a2e"/>
+          <w:sz w:val="20"/>
+          <w:szCs w:val="20"/>
+        </w:rPr>
+        <w:t xml:space="preserve">•  PASO 5: commit + push → Vercel despliega datos.js. Verificar en picks.html: eliminados muestran “Pick X — vacío”, nuevos aparecen disponibles.</w:t>
+      </w:r>
+    </w:p>
+    <w:p>
+      <w:pPr>
+        <w:spacing w:before="120" w:after="40"/>
+      </w:pPr>
+      <w:r>
+        <w:rPr>
+          <w:rFonts w:ascii="Arial" w:cs="Arial" w:eastAsia="Arial" w:hAnsi="Arial"/>
+          <w:b/>
+          <w:bCs/>
+          <w:color w:val="CE1126"/>
+          <w:sz w:val="22"/>
+          <w:szCs w:val="22"/>
+        </w:rPr>
+        <w:t>4. PROTECCIÓN EN CÓDIGO — picks.html (activa desde hoy)</w:t>
+      </w:r>
+    </w:p>
+    <w:p>
+      <w:pPr>
+        <w:spacing w:before="20" w:after="20"/>
+        <w:ind w:left="360"/>
+      </w:pPr>
+      <w:r>
+        <w:rPr>
+          <w:rFonts w:ascii="Arial" w:cs="Arial" w:eastAsia="Arial" w:hAnsi="Arial"/>
+          <w:color w:val="1a1a2e"/>
+          <w:sz w:val="20"/>
+          <w:szCs w:val="20"/>
+        </w:rPr>
+        <w:t xml:space="preserve">•  Capa 1 — cargarPicksEnState(): filtra del STATE cualquier ID que ya no exista en datos.js al cargar. Pick queda vacío en memoria. No se sobreescribe Supabase hasta que el usuario confirme.</w:t>
+      </w:r>
+    </w:p>
+    <w:p>
+      <w:pPr>
+        <w:spacing w:before="20" w:after="20"/>
+        <w:ind w:left="360"/>
+      </w:pPr>
+      <w:r>
+        <w:rPr>
+          <w:rFonts w:ascii="Arial" w:cs="Arial" w:eastAsia="Arial" w:hAnsi="Arial"/>
+          <w:color w:val="1a1a2e"/>
+          <w:sz w:val="20"/>
+          <w:szCs w:val="20"/>
+        </w:rPr>
+        <w:t xml:space="preserve">•  Capa 2 — renderPicksCategoria(): si un ID inválido llega al render, muestra “Pick X — vacío” en vez de desaparecer y hacer que el siguiente jugador salte a su posición.</w:t>
+      </w:r>
+    </w:p>
+    <w:p>
+      <w:pPr>
+        <w:spacing w:before="120" w:after="40"/>
+      </w:pPr>
+      <w:r>
+        <w:rPr>
+          <w:rFonts w:ascii="Arial" w:cs="Arial" w:eastAsia="Arial" w:hAnsi="Arial"/>
+          <w:b/>
+          <w:bCs/>
+          <w:color w:val="CE1126"/>
+          <w:sz w:val="22"/>
+          <w:szCs w:val="22"/>
+        </w:rPr>
+        <w:t>5. PENDIENTE: CARGAR TABLA “jugadores” EN SUPABASE</w:t>
+      </w:r>
+    </w:p>
+    <w:p>
+      <w:pPr>
+        <w:spacing w:before="20" w:after="20"/>
+        <w:ind w:left="360"/>
+      </w:pPr>
+      <w:r>
+        <w:rPr>
+          <w:rFonts w:ascii="Arial" w:cs="Arial" w:eastAsia="Arial" w:hAnsi="Arial"/>
+          <w:color w:val="1a1a2e"/>
+          <w:sz w:val="20"/>
+          <w:szCs w:val="20"/>
+        </w:rPr>
+        <w:t xml:space="preserve">•  Se puede y se debe cargar con nombre, posición y equipo desde ya, dejando sportmonks_id en NULL.</w:t>
+      </w:r>
+    </w:p>
+    <w:p>
+      <w:pPr>
+        <w:spacing w:before="20" w:after="20"/>
+        <w:ind w:left="360"/>
+      </w:pPr>
+      <w:r>
+        <w:rPr>
+          <w:rFonts w:ascii="Arial" w:cs="Arial" w:eastAsia="Arial" w:hAnsi="Arial"/>
+          <w:color w:val="1a1a2e"/>
+          <w:sz w:val="20"/>
+          <w:szCs w:val="20"/>
+        </w:rPr>
+        <w:t xml:space="preserve">•  Cuando se pague Sportmonks: UPDATE jugadores SET sportmonks_id = X WHERE nombre = ‘...’. El cron ya ignora filas con sportmonks_id NULL.</w:t>
+      </w:r>
+    </w:p>
+    <w:p>
+      <w:pPr>
+        <w:spacing w:before="20" w:after="20"/>
+        <w:ind w:left="360"/>
+      </w:pPr>
+      <w:r>
+        <w:rPr>
+          <w:rFonts w:ascii="Arial" w:cs="Arial" w:eastAsia="Arial" w:hAnsi="Arial"/>
+          <w:color w:val="1a1a2e"/>
+          <w:sz w:val="20"/>
+          <w:szCs w:val="20"/>
+        </w:rPr>
+        <w:t xml:space="preserve">•  Listas oficiales ya listas para insertar: Francia (26j), Nueva Zelanda (26j), Suecia (SWE), Bosnia-Herzegovina (BIH).</w:t>
       </w:r>
     </w:p>
     <w:p>

</xml_diff>

<commit_message>
docs: sportmonks_id protocol, picks_killer migration plan, localStorage fix
</commit_message>
<xml_diff>
--- a/DOCUMENTO RESUMEN ACTUALIZADO 14-05-2026.docx
+++ b/DOCUMENTO RESUMEN ACTUALIZADO 14-05-2026.docx
@@ -5731,6 +5731,226 @@
           <w:szCs w:val="20"/>
         </w:rPr>
         <w:t xml:space="preserve">•  Listas oficiales ya listas para insertar: Francia (26j), Nueva Zelanda (26j), Suecia (SWE), Bosnia-Herzegovina (BIH).</w:t>
+      </w:r>
+    </w:p>
+    <w:p>
+      <w:pPr>
+        <w:spacing w:before="200" w:after="80"/>
+        <w:pBdr>
+          <w:top w:val="single" w:sz="4" w:space="1" w:color="CCCCCC"/>
+        </w:pBdr>
+      </w:pPr>
+      <w:r>
+        <w:rPr>
+          <w:rFonts w:ascii="Arial" w:cs="Arial" w:eastAsia="Arial" w:hAnsi="Arial"/>
+          <w:i/>
+          <w:color w:val="6B7280"/>
+          <w:sz w:val="18"/>
+          <w:szCs w:val="18"/>
+        </w:rPr>
+        <w:t>Nota: Este archivo se actualiza al finalizar cada sesión de trabajo con Claude.</w:t>
+      </w:r>
+    </w:p>
+    <w:p>
+      <w:pPr>
+        <w:spacing w:before="320" w:after="120"/>
+        <w:pBdr>
+          <w:top w:val="single" w:sz="6" w:space="1" w:color="003087"/>
+        </w:pBdr>
+      </w:pPr>
+      <w:r>
+        <w:rPr>
+          <w:rFonts w:ascii="Arial" w:cs="Arial" w:eastAsia="Arial" w:hAnsi="Arial"/>
+          <w:b/>
+          <w:bCs/>
+          <w:color w:val="003087"/>
+          <w:sz w:val="28"/>
+          <w:szCs w:val="28"/>
+        </w:rPr>
+        <w:t>SESIÓN 14/05/2026 — PARTE 4: SUPABASE, SPORTMONKS Y PICKS_KILLER</w:t>
+      </w:r>
+    </w:p>
+    <w:p>
+      <w:pPr>
+        <w:spacing w:before="120" w:after="40"/>
+      </w:pPr>
+      <w:r>
+        <w:rPr>
+          <w:rFonts w:ascii="Arial" w:cs="Arial" w:eastAsia="Arial" w:hAnsi="Arial"/>
+          <w:b/>
+          <w:bCs/>
+          <w:color w:val="CE1126"/>
+          <w:sz w:val="22"/>
+          <w:szCs w:val="22"/>
+        </w:rPr>
+        <w:t>CARGAR sportmonks_id DE CADA JUGADOR A SUPABASE</w:t>
+      </w:r>
+    </w:p>
+    <w:p>
+      <w:pPr>
+        <w:spacing w:before="20" w:after="20"/>
+        <w:ind w:left="360"/>
+      </w:pPr>
+      <w:r>
+        <w:rPr>
+          <w:rFonts w:ascii="Arial" w:cs="Arial" w:eastAsia="Arial" w:hAnsi="Arial"/>
+          <w:color w:val="1a1a2e"/>
+          <w:sz w:val="20"/>
+          <w:szCs w:val="20"/>
+        </w:rPr>
+        <w:t xml:space="preserve">•  La tabla jugadores en Supabase ya tiene los 107 jugadores cargados (FRA 26, NZL 26, SWE 29, BIH 26) con sportmonks_id en NULL.</w:t>
+      </w:r>
+    </w:p>
+    <w:p>
+      <w:pPr>
+        <w:spacing w:before="20" w:after="20"/>
+        <w:ind w:left="360"/>
+      </w:pPr>
+      <w:r>
+        <w:rPr>
+          <w:rFonts w:ascii="Arial" w:cs="Arial" w:eastAsia="Arial" w:hAnsi="Arial"/>
+          <w:color w:val="1a1a2e"/>
+          <w:sz w:val="20"/>
+          <w:szCs w:val="20"/>
+        </w:rPr>
+        <w:t xml:space="preserve">•  Cuando se pague Sportmonks: buscar el ID de cada jugador en la API de Sportmonks y ejecutar: UPDATE jugadores SET sportmonks_id = X WHERE nombre_corto = ‘fra-23’ (nombre_corto guarda el ID de datos.js como referencia). El cron ya ignora jugadores con sportmonks_id NULL.</w:t>
+      </w:r>
+    </w:p>
+    <w:p>
+      <w:pPr>
+        <w:spacing w:before="20" w:after="20"/>
+        <w:ind w:left="360"/>
+      </w:pPr>
+      <w:r>
+        <w:rPr>
+          <w:rFonts w:ascii="Arial" w:cs="Arial" w:eastAsia="Arial" w:hAnsi="Arial"/>
+          <w:color w:val="1a1a2e"/>
+          <w:sz w:val="20"/>
+          <w:szCs w:val="20"/>
+        </w:rPr>
+        <w:t xml:space="preserve">•  Script disponible: scripts/cargar-equipos-jugadores.js (idempotente, se puede correr de nuevo al agregar más equipos sin duplicar).</w:t>
+      </w:r>
+    </w:p>
+    <w:p>
+      <w:pPr>
+        <w:spacing w:before="120" w:after="40"/>
+      </w:pPr>
+      <w:r>
+        <w:rPr>
+          <w:rFonts w:ascii="Arial" w:cs="Arial" w:eastAsia="Arial" w:hAnsi="Arial"/>
+          <w:b/>
+          <w:bCs/>
+          <w:color w:val="CE1126"/>
+          <w:sz w:val="22"/>
+          <w:szCs w:val="22"/>
+        </w:rPr>
+        <w:t>MIGRACIÓN A TABLA picks_killer (cuándo y cómo)</w:t>
+      </w:r>
+    </w:p>
+    <w:p>
+      <w:pPr>
+        <w:spacing w:before="20" w:after="20"/>
+        <w:ind w:left="360"/>
+      </w:pPr>
+      <w:r>
+        <w:rPr>
+          <w:rFonts w:ascii="Arial" w:cs="Arial" w:eastAsia="Arial" w:hAnsi="Arial"/>
+          <w:color w:val="1a1a2e"/>
+          <w:sz w:val="20"/>
+          <w:szCs w:val="20"/>
+        </w:rPr>
+        <w:t xml:space="preserve">•  ESTADO ACTUAL: los picks del Killer se guardan en usuarios.picks_data.killer (JSONB). El cron ya referencia una tabla relacional picks_killer que aún no existe.</w:t>
+      </w:r>
+    </w:p>
+    <w:p>
+      <w:pPr>
+        <w:spacing w:before="20" w:after="20"/>
+        <w:ind w:left="360"/>
+      </w:pPr>
+      <w:r>
+        <w:rPr>
+          <w:rFonts w:ascii="Arial" w:cs="Arial" w:eastAsia="Arial" w:hAnsi="Arial"/>
+          <w:color w:val="1a1a2e"/>
+          <w:sz w:val="20"/>
+          <w:szCs w:val="20"/>
+        </w:rPr>
+        <w:t xml:space="preserve">•  CUÁNDO MIGRAR: antes de que comiencen los partidos (junio 2026). No es urgente hasta que el cron necesite calcular el ranking de verdad.</w:t>
+      </w:r>
+    </w:p>
+    <w:p>
+      <w:pPr>
+        <w:spacing w:before="20" w:after="20"/>
+        <w:ind w:left="360"/>
+      </w:pPr>
+      <w:r>
+        <w:rPr>
+          <w:rFonts w:ascii="Arial" w:cs="Arial" w:eastAsia="Arial" w:hAnsi="Arial"/>
+          <w:color w:val="1a1a2e"/>
+          <w:sz w:val="20"/>
+          <w:szCs w:val="20"/>
+        </w:rPr>
+        <w:t xml:space="preserve">•  CÓMO: crear tabla picks_killer (usuario_id UUID, jugador_id UUID FK jugadores.id). Luego script que lee usuarios.picks_data.killer de cada usuario, mapea cada ID de datos.js (ej: ‘fra-23’) a jugadores.id usando la columna nombre_corto, e inserta las filas. Actualizar la API para que al guardar picks también escriba en picks_killer.</w:t>
+      </w:r>
+    </w:p>
+    <w:p>
+      <w:pPr>
+        <w:spacing w:before="20" w:after="20"/>
+        <w:ind w:left="360"/>
+      </w:pPr>
+      <w:r>
+        <w:rPr>
+          <w:rFonts w:ascii="Arial" w:cs="Arial" w:eastAsia="Arial" w:hAnsi="Arial"/>
+          <w:color w:val="1a1a2e"/>
+          <w:sz w:val="20"/>
+          <w:szCs w:val="20"/>
+        </w:rPr>
+        <w:t xml:space="preserve">•  NOTA CLAVE: la columna nombre_corto en jugadores almacena el ID de datos.js (ej: ‘fra-23’) como puente entre el frontend y Supabase. Sin ese puente la migración no es posible.</w:t>
+      </w:r>
+    </w:p>
+    <w:p>
+      <w:pPr>
+        <w:spacing w:before="120" w:after="40"/>
+      </w:pPr>
+      <w:r>
+        <w:rPr>
+          <w:rFonts w:ascii="Arial" w:cs="Arial" w:eastAsia="Arial" w:hAnsi="Arial"/>
+          <w:b/>
+          <w:bCs/>
+          <w:color w:val="CE1126"/>
+          <w:sz w:val="22"/>
+          <w:szCs w:val="22"/>
+        </w:rPr>
+        <w:t>FIX: THURAM Y OTROS PICKS OBSOLETOS EN LOCALSTORAGE</w:t>
+      </w:r>
+    </w:p>
+    <w:p>
+      <w:pPr>
+        <w:spacing w:before="20" w:after="20"/>
+        <w:ind w:left="360"/>
+      </w:pPr>
+      <w:r>
+        <w:rPr>
+          <w:rFonts w:ascii="Arial" w:cs="Arial" w:eastAsia="Arial" w:hAnsi="Arial"/>
+          <w:color w:val="1a1a2e"/>
+          <w:sz w:val="20"/>
+          <w:szCs w:val="20"/>
+        </w:rPr>
+        <w:t xml:space="preserve">•  Causa: localStorage del navegador tenía picks guardados antes de la limpieza en Supabase. Al cargar la página, si la sesión fallaba, se usaban los picks del caché local en vez de los de Supabase.</w:t>
+      </w:r>
+    </w:p>
+    <w:p>
+      <w:pPr>
+        <w:spacing w:before="20" w:after="20"/>
+        <w:ind w:left="360"/>
+      </w:pPr>
+      <w:r>
+        <w:rPr>
+          <w:rFonts w:ascii="Arial" w:cs="Arial" w:eastAsia="Arial" w:hAnsi="Arial"/>
+          <w:color w:val="1a1a2e"/>
+          <w:sz w:val="20"/>
+          <w:szCs w:val="20"/>
+        </w:rPr>
+        <w:t xml:space="preserve">•  Fix aplicado en picks.html: cuando se cargan picks exitosamente desde la API de Supabase, se sobreescribe también el localStorage con esos mismos datos. Supabase siempre gana sobre el caché local.</w:t>
       </w:r>
     </w:p>
     <w:p>

</xml_diff>